<commit_message>
Update Proyecto MSB - SneakerHub.docx
</commit_message>
<xml_diff>
--- a/Proyecto/Proyecto MSB - SneakerHub.docx
+++ b/Proyecto/Proyecto MSB - SneakerHub.docx
@@ -2965,13 +2965,7 @@
       <w:bookmarkStart w:id="0" w:name="_Toc219050242"/>
       <w:r>
         <w:lastRenderedPageBreak/>
-        <w:t>1</w:t>
-      </w:r>
-      <w:r>
-        <w:t xml:space="preserve">. </w:t>
-      </w:r>
-      <w:r>
-        <w:t xml:space="preserve">Resumen / </w:t>
+        <w:t xml:space="preserve">1. Resumen / </w:t>
       </w:r>
       <w:proofErr w:type="spellStart"/>
       <w:r>
@@ -2986,13 +2980,7 @@
       </w:pPr>
       <w:bookmarkStart w:id="1" w:name="_Toc219050243"/>
       <w:r>
-        <w:t>2</w:t>
-      </w:r>
-      <w:r>
-        <w:t xml:space="preserve">. </w:t>
-      </w:r>
-      <w:r>
-        <w:t>Introducción/Justificación del proyecto</w:t>
+        <w:t>2. Introducción/Justificación del proyecto</w:t>
       </w:r>
       <w:bookmarkEnd w:id="1"/>
       <w:r>
@@ -3005,13 +2993,7 @@
       </w:pPr>
       <w:bookmarkStart w:id="2" w:name="_Toc219050244"/>
       <w:r>
-        <w:t>3</w:t>
-      </w:r>
-      <w:r>
-        <w:t xml:space="preserve">. </w:t>
-      </w:r>
-      <w:r>
-        <w:t>Estado del Arte</w:t>
+        <w:t>3. Estado del Arte</w:t>
       </w:r>
       <w:bookmarkEnd w:id="2"/>
     </w:p>
@@ -3021,13 +3003,7 @@
       </w:pPr>
       <w:bookmarkStart w:id="3" w:name="_Toc219050245"/>
       <w:r>
-        <w:t>4</w:t>
-      </w:r>
-      <w:r>
-        <w:t xml:space="preserve">. </w:t>
-      </w:r>
-      <w:r>
-        <w:t>Tecnologías utilizadas</w:t>
+        <w:t>4. Tecnologías utilizadas</w:t>
       </w:r>
       <w:bookmarkEnd w:id="3"/>
     </w:p>
@@ -3037,17 +3013,7 @@
       </w:pPr>
       <w:bookmarkStart w:id="4" w:name="_Toc219050246"/>
       <w:r>
-        <w:t>5</w:t>
-      </w:r>
-      <w:r>
-        <w:t xml:space="preserve">. </w:t>
-      </w:r>
-      <w:r>
-        <w:t>Planificación Temporal y Coste del Proyecto</w:t>
-      </w:r>
-      <w:r>
-        <w:tab/>
-        <w:t>4</w:t>
+        <w:t>5. Planificación Temporal y Coste del Proyecto</w:t>
       </w:r>
       <w:bookmarkEnd w:id="4"/>
     </w:p>
@@ -3057,13 +3023,7 @@
       </w:pPr>
       <w:bookmarkStart w:id="5" w:name="_Toc219050247"/>
       <w:r>
-        <w:t>6</w:t>
-      </w:r>
-      <w:r>
-        <w:t xml:space="preserve">. </w:t>
-      </w:r>
-      <w:r>
-        <w:t>Desarrollo del proyecto</w:t>
+        <w:t>6. Desarrollo del proyecto</w:t>
       </w:r>
       <w:bookmarkEnd w:id="5"/>
     </w:p>
@@ -3073,10 +3033,7 @@
       </w:pPr>
       <w:bookmarkStart w:id="6" w:name="_Toc219050248"/>
       <w:r>
-        <w:t>6.1</w:t>
-      </w:r>
-      <w:r>
-        <w:t xml:space="preserve">. </w:t>
+        <w:t xml:space="preserve">6.1. </w:t>
       </w:r>
       <w:r>
         <w:tab/>
@@ -3136,10 +3093,7 @@
       </w:r>
       <w:r>
         <w:tab/>
-        <w:t>Fase de prueba</w:t>
-      </w:r>
-      <w:r>
-        <w:t>s</w:t>
+        <w:t>Fase de pruebas</w:t>
       </w:r>
       <w:bookmarkEnd w:id="10"/>
     </w:p>
@@ -3180,13 +3134,7 @@
       </w:pPr>
       <w:bookmarkStart w:id="13" w:name="_Toc219050255"/>
       <w:r>
-        <w:t>7</w:t>
-      </w:r>
-      <w:r>
-        <w:t xml:space="preserve">. </w:t>
-      </w:r>
-      <w:r>
-        <w:t>Manual de usuario (Elaboración de un manual detallado de la aplicación)</w:t>
+        <w:t>7. Manual de usuario (Elaboración de un manual detallado de la aplicación)</w:t>
       </w:r>
       <w:bookmarkEnd w:id="13"/>
     </w:p>
@@ -3196,13 +3144,7 @@
       </w:pPr>
       <w:bookmarkStart w:id="14" w:name="_Toc219050256"/>
       <w:r>
-        <w:t>8</w:t>
-      </w:r>
-      <w:r>
-        <w:t xml:space="preserve">. </w:t>
-      </w:r>
-      <w:r>
-        <w:t>Conclusión del proyecto</w:t>
+        <w:t>8. Conclusión del proyecto</w:t>
       </w:r>
       <w:bookmarkEnd w:id="14"/>
       <w:r>
@@ -3215,13 +3157,7 @@
       </w:pPr>
       <w:bookmarkStart w:id="15" w:name="_Toc219050257"/>
       <w:r>
-        <w:t>9</w:t>
-      </w:r>
-      <w:r>
-        <w:t xml:space="preserve">. </w:t>
-      </w:r>
-      <w:r>
-        <w:t>Líneas de investigación y desarrollo futuras</w:t>
+        <w:t>9. Líneas de investigación y desarrollo futuras</w:t>
       </w:r>
       <w:bookmarkEnd w:id="15"/>
     </w:p>
@@ -3231,13 +3167,7 @@
       </w:pPr>
       <w:bookmarkStart w:id="16" w:name="_Toc219050258"/>
       <w:r>
-        <w:t>10</w:t>
-      </w:r>
-      <w:r>
-        <w:t xml:space="preserve">. </w:t>
-      </w:r>
-      <w:r>
-        <w:t>ANEXOS</w:t>
+        <w:t>10. ANEXOS</w:t>
       </w:r>
       <w:bookmarkEnd w:id="16"/>
     </w:p>
@@ -3248,13 +3178,7 @@
       <w:bookmarkStart w:id="17" w:name="_Toc219050259"/>
       <w:r>
         <w:lastRenderedPageBreak/>
-        <w:t>11</w:t>
-      </w:r>
-      <w:r>
-        <w:t xml:space="preserve">. </w:t>
-      </w:r>
-      <w:r>
-        <w:t>Bibliografía</w:t>
+        <w:t>11. Bibliografía</w:t>
       </w:r>
       <w:bookmarkEnd w:id="17"/>
     </w:p>
@@ -3264,13 +3188,7 @@
       </w:pPr>
       <w:bookmarkStart w:id="18" w:name="_Toc219050260"/>
       <w:r>
-        <w:t>12</w:t>
-      </w:r>
-      <w:r>
-        <w:t xml:space="preserve">. </w:t>
-      </w:r>
-      <w:r>
-        <w:t>Recomendaciones y Formato del documento</w:t>
+        <w:t>12. Recomendaciones y Formato del documento</w:t>
       </w:r>
       <w:bookmarkEnd w:id="18"/>
     </w:p>
@@ -3280,10 +3198,7 @@
       </w:pPr>
       <w:bookmarkStart w:id="19" w:name="_Toc219050261"/>
       <w:r>
-        <w:t>12.1</w:t>
-      </w:r>
-      <w:r>
-        <w:t xml:space="preserve">. </w:t>
+        <w:t xml:space="preserve">12.1. </w:t>
       </w:r>
       <w:r>
         <w:tab/>
@@ -3300,13 +3215,7 @@
       </w:pPr>
       <w:bookmarkStart w:id="20" w:name="_Toc219050262"/>
       <w:r>
-        <w:t>13</w:t>
-      </w:r>
-      <w:r>
-        <w:t xml:space="preserve">. </w:t>
-      </w:r>
-      <w:r>
-        <w:t>FECHAS PROPUESTAS</w:t>
+        <w:t>13. FECHAS PROPUESTAS</w:t>
       </w:r>
       <w:bookmarkEnd w:id="20"/>
     </w:p>
@@ -3316,13 +3225,7 @@
       </w:pPr>
       <w:bookmarkStart w:id="21" w:name="_Toc219050263"/>
       <w:r>
-        <w:t>13.1</w:t>
-      </w:r>
-      <w:r>
-        <w:t xml:space="preserve">. </w:t>
-      </w:r>
-      <w:r>
-        <w:t>REVISIÓN DEL PROYECTO</w:t>
+        <w:t>13.1. REVISIÓN DEL PROYECTO</w:t>
       </w:r>
       <w:bookmarkEnd w:id="21"/>
     </w:p>

</xml_diff>